<commit_message>
10 23 2025 UTA
</commit_message>
<xml_diff>
--- a/Classification Metrics ChatGPT July 2025.docx
+++ b/Classification Metrics ChatGPT July 2025.docx
@@ -448,15 +448,7 @@
         <w:t>Definition</w:t>
       </w:r>
       <w:r>
-        <w:t xml:space="preserve">: The harmonic </w:t>
-      </w:r>
-      <w:proofErr w:type="gramStart"/>
-      <w:r>
-        <w:t>mean</w:t>
-      </w:r>
-      <w:proofErr w:type="gramEnd"/>
-      <w:r>
-        <w:t xml:space="preserve"> of precision and recall. It balances the trade-off between precision and recall, especially when you need to take both false positives and false negatives into account.</w:t>
+        <w:t>: The harmonic mean of precision and recall. It balances the trade-off between precision and recall, especially when you need to take both false positives and false negatives into account.</w:t>
       </w:r>
     </w:p>
     <w:p>
@@ -756,6 +748,39 @@
       </w:r>
     </w:p>
     <w:p/>
+    <w:p>
+      <w:r>
+        <w:rPr>
+          <w:b/>
+          <w:bCs/>
+        </w:rPr>
+        <w:t>Type 1 Error</w:t>
+      </w:r>
+      <w:r>
+        <w:t xml:space="preserve"> </w:t>
+      </w:r>
+      <w:r>
+        <w:t>–</w:t>
+      </w:r>
+      <w:r>
+        <w:t xml:space="preserve"> </w:t>
+      </w:r>
+      <w:r>
+        <w:t xml:space="preserve">False Positives </w:t>
+      </w:r>
+    </w:p>
+    <w:p>
+      <w:r>
+        <w:rPr>
+          <w:b/>
+          <w:bCs/>
+        </w:rPr>
+        <w:t>Type 2 Error</w:t>
+      </w:r>
+      <w:r>
+        <w:t xml:space="preserve"> – False Negatives </w:t>
+      </w:r>
+    </w:p>
     <w:sectPr>
       <w:pgSz w:w="12240" w:h="15840"/>
       <w:pgMar w:top="1440" w:right="1440" w:bottom="1440" w:left="1440" w:header="720" w:footer="720" w:gutter="0"/>
@@ -2288,6 +2313,7 @@
   <w:style w:type="character" w:default="1" w:styleId="DefaultParagraphFont">
     <w:name w:val="Default Paragraph Font"/>
     <w:uiPriority w:val="1"/>
+    <w:semiHidden/>
     <w:unhideWhenUsed/>
   </w:style>
   <w:style w:type="table" w:default="1" w:styleId="TableNormal">

</xml_diff>